<commit_message>
feat - added bug report 3
</commit_message>
<xml_diff>
--- a/BugReporting/ECEBUG1.docx
+++ b/BugReporting/ECEBUG1.docx
@@ -39,16 +39,7 @@
           <w:sz w:val="48"/>
           <w:szCs w:val="48"/>
         </w:rPr>
-        <w:t xml:space="preserve">Title: </w:t>
-      </w:r>
-      <w:r>
-        <w:rPr>
-          <w:b/>
-          <w:bCs/>
-          <w:sz w:val="48"/>
-          <w:szCs w:val="48"/>
-        </w:rPr>
-        <w:t>Windows 11 Pro – Navbar – Top Navbar does not hide cleanly on scroll, cutting off top-right search</w:t>
+        <w:t>Title: Windows 11 Pro – Navbar – Top Navbar does not hide cleanly on scroll, cutting off top-right search</w:t>
       </w:r>
     </w:p>
     <w:p>
@@ -322,6 +313,7 @@
         </w:rPr>
         <w:t xml:space="preserve"> | </w:t>
       </w:r>
+      <w:proofErr w:type="gramStart"/>
       <w:r>
         <w:rPr>
           <w:b/>
@@ -344,6 +336,7 @@
         </w:rPr>
         <w:t xml:space="preserve"> ]</w:t>
       </w:r>
+      <w:proofErr w:type="gramEnd"/>
       <w:r>
         <w:rPr>
           <w:b/>
@@ -410,6 +403,7 @@
         </w:rPr>
         <w:t xml:space="preserve"> | </w:t>
       </w:r>
+      <w:proofErr w:type="gramStart"/>
       <w:r>
         <w:rPr>
           <w:b/>
@@ -432,6 +426,7 @@
         </w:rPr>
         <w:t xml:space="preserve"> ]</w:t>
       </w:r>
+      <w:proofErr w:type="gramEnd"/>
       <w:r>
         <w:rPr>
           <w:b/>
@@ -496,8 +491,21 @@
           <w:sz w:val="32"/>
           <w:szCs w:val="32"/>
         </w:rPr>
-        <w:t xml:space="preserve"> | Content | Performance | Crash ]</w:t>
-      </w:r>
+        <w:t xml:space="preserve"> | Content | Performance | </w:t>
+      </w:r>
+      <w:proofErr w:type="gramStart"/>
+      <w:r>
+        <w:rPr>
+          <w:b/>
+          <w:bCs/>
+          <w:i/>
+          <w:iCs/>
+          <w:sz w:val="32"/>
+          <w:szCs w:val="32"/>
+        </w:rPr>
+        <w:t>Crash ]</w:t>
+      </w:r>
+      <w:proofErr w:type="gramEnd"/>
       <w:r>
         <w:rPr>
           <w:b/>
@@ -562,8 +570,21 @@
           <w:sz w:val="32"/>
           <w:szCs w:val="32"/>
         </w:rPr>
-        <w:t xml:space="preserve"> | Often | Sometimes | Rarely | Once ]</w:t>
-      </w:r>
+        <w:t xml:space="preserve"> | Often | Sometimes | Rarely | </w:t>
+      </w:r>
+      <w:proofErr w:type="gramStart"/>
+      <w:r>
+        <w:rPr>
+          <w:b/>
+          <w:bCs/>
+          <w:i/>
+          <w:iCs/>
+          <w:sz w:val="32"/>
+          <w:szCs w:val="32"/>
+        </w:rPr>
+        <w:t>Once ]</w:t>
+      </w:r>
+      <w:proofErr w:type="gramEnd"/>
       <w:r>
         <w:rPr>
           <w:b/>
@@ -870,9 +891,9 @@
           <w:noProof/>
         </w:rPr>
         <w:drawing>
-          <wp:inline distT="0" distB="0" distL="0" distR="0" wp14:anchorId="40D21EB6" wp14:editId="0C8258D4">
-            <wp:extent cx="2954976" cy="1844565"/>
-            <wp:effectExtent l="0" t="0" r="0" b="3810"/>
+          <wp:inline distT="0" distB="0" distL="0" distR="0" wp14:anchorId="40D21EB6" wp14:editId="75F8583B">
+            <wp:extent cx="2954135" cy="1733550"/>
+            <wp:effectExtent l="0" t="0" r="0" b="0"/>
             <wp:docPr id="1709836041" name="Picture 1" descr="The image shows a webpage from the University of Florida's Electrical and Computer Engineering Department, featuring information on various topics such as pain relief research, battery-free neural implants, and the appointment of Josￃﾩ Fortes as the new acting chair, along with a mention of the 2026 US-Korea tech conference.&#10;&#10;AI-generated content may be incorrect."/>
             <wp:cNvGraphicFramePr>
               <a:graphicFrameLocks xmlns:a="http://schemas.openxmlformats.org/drawingml/2006/main" noChangeAspect="1"/>
@@ -886,7 +907,7 @@
                       <a:picLocks noChangeAspect="1" noChangeArrowheads="1"/>
                     </pic:cNvPicPr>
                   </pic:nvPicPr>
-                  <pic:blipFill>
+                  <pic:blipFill rotWithShape="1">
                     <a:blip r:embed="rId5" cstate="print">
                       <a:extLst>
                         <a:ext uri="{28A0092B-C50C-407E-A947-70E740481C1C}">
@@ -894,7 +915,7 @@
                         </a:ext>
                       </a:extLst>
                     </a:blip>
-                    <a:srcRect/>
+                    <a:srcRect b="5992"/>
                     <a:stretch>
                       <a:fillRect/>
                     </a:stretch>
@@ -902,7 +923,7 @@
                   <pic:spPr bwMode="auto">
                     <a:xfrm>
                       <a:off x="0" y="0"/>
-                      <a:ext cx="2959553" cy="1847422"/>
+                      <a:ext cx="2959553" cy="1736729"/>
                     </a:xfrm>
                     <a:prstGeom prst="rect">
                       <a:avLst/>
@@ -911,167 +932,17 @@
                     <a:ln>
                       <a:noFill/>
                     </a:ln>
+                    <a:extLst>
+                      <a:ext uri="{53640926-AAD7-44D8-BBD7-CCE9431645EC}">
+                        <a14:shadowObscured xmlns:a14="http://schemas.microsoft.com/office/drawing/2010/main"/>
+                      </a:ext>
+                    </a:extLst>
                   </pic:spPr>
                 </pic:pic>
               </a:graphicData>
             </a:graphic>
           </wp:inline>
         </w:drawing>
-      </w:r>
-    </w:p>
-    <w:p>
-      <w:pPr>
-        <w:rPr>
-          <w:sz w:val="32"/>
-          <w:szCs w:val="32"/>
-        </w:rPr>
-      </w:pPr>
-    </w:p>
-    <w:p>
-      <w:pPr>
-        <w:numPr>
-          <w:ilvl w:val="0"/>
-          <w:numId w:val="5"/>
-        </w:numPr>
-        <w:rPr>
-          <w:b/>
-          <w:bCs/>
-          <w:sz w:val="32"/>
-          <w:szCs w:val="32"/>
-        </w:rPr>
-      </w:pPr>
-      <w:r>
-        <w:rPr>
-          <w:b/>
-          <w:bCs/>
-          <w:sz w:val="32"/>
-          <w:szCs w:val="32"/>
-        </w:rPr>
-        <w:t xml:space="preserve">Screen Recording: </w:t>
-      </w:r>
-      <w:r>
-        <w:rPr>
-          <w:b/>
-          <w:bCs/>
-          <w:sz w:val="32"/>
-          <w:szCs w:val="32"/>
-        </w:rPr>
-        <w:t xml:space="preserve"> N/A</w:t>
-      </w:r>
-    </w:p>
-    <w:p>
-      <w:pPr>
-        <w:numPr>
-          <w:ilvl w:val="0"/>
-          <w:numId w:val="5"/>
-        </w:numPr>
-        <w:rPr>
-          <w:b/>
-          <w:bCs/>
-          <w:sz w:val="32"/>
-          <w:szCs w:val="32"/>
-        </w:rPr>
-      </w:pPr>
-      <w:r>
-        <w:rPr>
-          <w:b/>
-          <w:bCs/>
-          <w:sz w:val="32"/>
-          <w:szCs w:val="32"/>
-        </w:rPr>
-        <w:t xml:space="preserve">Console Logs: </w:t>
-      </w:r>
-      <w:r>
-        <w:rPr>
-          <w:b/>
-          <w:bCs/>
-          <w:sz w:val="32"/>
-          <w:szCs w:val="32"/>
-        </w:rPr>
-        <w:t>N/A</w:t>
-      </w:r>
-    </w:p>
-    <w:p>
-      <w:pPr>
-        <w:numPr>
-          <w:ilvl w:val="0"/>
-          <w:numId w:val="5"/>
-        </w:numPr>
-        <w:rPr>
-          <w:b/>
-          <w:bCs/>
-          <w:sz w:val="32"/>
-          <w:szCs w:val="32"/>
-        </w:rPr>
-      </w:pPr>
-      <w:r>
-        <w:rPr>
-          <w:b/>
-          <w:bCs/>
-          <w:sz w:val="32"/>
-          <w:szCs w:val="32"/>
-        </w:rPr>
-        <w:t xml:space="preserve">Other Evidence: </w:t>
-      </w:r>
-      <w:r>
-        <w:rPr>
-          <w:b/>
-          <w:bCs/>
-          <w:sz w:val="32"/>
-          <w:szCs w:val="32"/>
-        </w:rPr>
-        <w:t>N/A</w:t>
-      </w:r>
-    </w:p>
-    <w:p>
-      <w:pPr>
-        <w:rPr>
-          <w:b/>
-          <w:bCs/>
-          <w:sz w:val="32"/>
-          <w:szCs w:val="32"/>
-        </w:rPr>
-      </w:pPr>
-      <w:r>
-        <w:rPr>
-          <w:b/>
-          <w:bCs/>
-          <w:sz w:val="32"/>
-          <w:szCs w:val="32"/>
-        </w:rPr>
-        <w:t>7. Additional Information</w:t>
-      </w:r>
-    </w:p>
-    <w:p>
-      <w:pPr>
-        <w:numPr>
-          <w:ilvl w:val="0"/>
-          <w:numId w:val="6"/>
-        </w:numPr>
-        <w:rPr>
-          <w:b/>
-          <w:bCs/>
-          <w:sz w:val="32"/>
-          <w:szCs w:val="32"/>
-        </w:rPr>
-      </w:pPr>
-      <w:r>
-        <w:rPr>
-          <w:b/>
-          <w:bCs/>
-          <w:sz w:val="32"/>
-          <w:szCs w:val="32"/>
-        </w:rPr>
-        <w:t>Additional Notes:</w:t>
-      </w:r>
-      <w:r>
-        <w:rPr>
-          <w:b/>
-          <w:bCs/>
-          <w:sz w:val="32"/>
-          <w:szCs w:val="32"/>
-        </w:rPr>
-        <w:t xml:space="preserve"> N/A</w:t>
       </w:r>
     </w:p>
     <w:p/>

</xml_diff>